<commit_message>
Fix blank loan agreement PDFs and quiet login icons.
Stop re-saving LibreOffice PDFs through pdf-lib (it stripped CID body text), fill footer/header merge fields including <<current_date>>, default to the filled pdf-lib layout, and shrink login field icons.

Co-authored-by: Cursor <cursoragent@cursor.com>
</commit_message>
<xml_diff>
--- a/product-idea-assets/Loan-agreement .docx
+++ b/product-idea-assets/Loan-agreement .docx
@@ -1895,82 +1895,22 @@
 </file>
 
 <file path=word/footer1.xml><?xml version="1.0" encoding="utf-8"?>
-<w:ftr xmlns:wpc="http://schemas.microsoft.com/office/word/2010/wordprocessingCanvas" xmlns:cx="http://schemas.microsoft.com/office/drawing/2014/chartex" xmlns:cx1="http://schemas.microsoft.com/office/drawing/2015/9/8/chartex" xmlns:cx2="http://schemas.microsoft.com/office/drawing/2015/10/21/chartex" xmlns:cx3="http://schemas.microsoft.com/office/drawing/2016/5/9/chartex" xmlns:cx4="http://schemas.microsoft.com/office/drawing/2016/5/10/chartex" xmlns:cx5="http://schemas.microsoft.com/office/drawing/2016/5/11/chartex" xmlns:cx6="http://schemas.microsoft.com/office/drawing/2016/5/12/chartex" xmlns:cx7="http://schemas.microsoft.com/office/drawing/2016/5/13/chartex" xmlns:cx8="http://schemas.microsoft.com/office/drawing/2016/5/14/chartex" xmlns:mc="http://schemas.openxmlformats.org/markup-compatibility/2006" xmlns:aink="http://schemas.microsoft.com/office/drawing/2016/ink" xmlns:am3d="http://schemas.microsoft.com/office/drawing/2017/model3d" xmlns:o="urn:schemas-microsoft-com:office:office" xmlns:oel="http://schemas.microsoft.com/office/2019/extlst" xmlns:r="http://schemas.openxmlformats.org/officeDocument/2006/relationships" xmlns:m="http://schemas.openxmlformats.org/officeDocument/2006/math" xmlns:v="urn:schemas-microsoft-com:vml" xmlns:wp14="http://schemas.microsoft.com/office/word/2010/wordprocessingDrawing" xmlns:wp="http://schemas.openxmlformats.org/drawingml/2006/wordprocessingDrawing" xmlns:w10="urn:schemas-microsoft-com:office:word" xmlns:w="http://schemas.openxmlformats.org/wordprocessingml/2006/main" xmlns:w14="http://schemas.microsoft.com/office/word/2010/wordml" xmlns:w15="http://schemas.microsoft.com/office/word/2012/wordml" xmlns:w16cex="http://schemas.microsoft.com/office/word/2018/wordml/cex" xmlns:w16cid="http://schemas.microsoft.com/office/word/2016/wordml/cid" xmlns:w16="http://schemas.microsoft.com/office/word/2018/wordml" xmlns:w16du="http://schemas.microsoft.com/office/word/2023/wordml/word16du" xmlns:w16sdtdh="http://schemas.microsoft.com/office/word/2020/wordml/sdtdatahash" xmlns:w16sdtfl="http://schemas.microsoft.com/office/word/2024/wordml/sdtformatlock" xmlns:w16se="http://schemas.microsoft.com/office/word/2015/wordml/symex" xmlns:wpg="http://schemas.microsoft.com/office/word/2010/wordprocessingGroup" xmlns:wpi="http://schemas.microsoft.com/office/word/2010/wordprocessingInk" xmlns:wne="http://schemas.microsoft.com/office/word/2006/wordml" xmlns:wps="http://schemas.microsoft.com/office/word/2010/wordprocessingShape" mc:Ignorable="w14 w15 w16se w16cid w16 w16cex w16sdtdh w16sdtfl w16du wp14">
+<w:ftr xmlns:w="http://schemas.openxmlformats.org/wordprocessingml/2006/main" xmlns:r="http://schemas.openxmlformats.org/officeDocument/2006/relationships" xmlns:mc="http://schemas.openxmlformats.org/markup-compatibility/2006" mc:Ignorable="w14 w15">
   <w:p>
     <w:pPr>
       <w:pStyle w:val="Footer"/>
-      <w:jc w:val="right"/>
+      <w:jc w:val="center"/>
       <w:rPr>
-        <w:b/>
-        <w:bCs/>
-        <w:lang w:val="en-GB"/>
+        <w:sz w:val="16"/>
+        <w:szCs w:val="16"/>
       </w:rPr>
     </w:pPr>
     <w:r>
       <w:rPr>
-        <w:lang w:val="en-GB"/>
+        <w:sz w:val="16"/>
+        <w:szCs w:val="16"/>
       </w:rPr>
-      <w:t xml:space="preserve">Generate by: </w:t>
-    </w:r>
-    <w:proofErr w:type="spellStart"/>
-    <w:r>
-      <w:rPr>
-        <w:lang w:val="en-GB"/>
-      </w:rPr>
-      <w:t>Rembeh</w:t>
-    </w:r>
-    <w:proofErr w:type="spellEnd"/>
-    <w:r>
-      <w:rPr>
-        <w:lang w:val="en-GB"/>
-      </w:rPr>
-      <w:t xml:space="preserve"> </w:t>
-    </w:r>
-    <w:proofErr w:type="spellStart"/>
-    <w:r>
-      <w:rPr>
-        <w:lang w:val="en-GB"/>
-      </w:rPr>
-      <w:t>Finacial</w:t>
-    </w:r>
-    <w:proofErr w:type="spellEnd"/>
-    <w:r>
-      <w:rPr>
-        <w:lang w:val="en-GB"/>
-      </w:rPr>
-      <w:t xml:space="preserve"> Software (</w:t>
-    </w:r>
-    <w:proofErr w:type="spellStart"/>
-    <w:r>
-      <w:rPr>
-        <w:lang w:val="en-GB"/>
-      </w:rPr>
-      <w:t>Antikra</w:t>
-    </w:r>
-    <w:proofErr w:type="spellEnd"/>
-    <w:r>
-      <w:rPr>
-        <w:lang w:val="en-GB"/>
-      </w:rPr>
-      <w:t xml:space="preserve"> Mechanism). Date: &lt;&lt;</w:t>
-    </w:r>
-    <w:proofErr w:type="spellStart"/>
-    <w:r>
-      <w:rPr>
-        <w:b/>
-        <w:bCs/>
-        <w:lang w:val="en-GB"/>
-      </w:rPr>
-      <w:t>current_date</w:t>
-    </w:r>
-    <w:proofErr w:type="spellEnd"/>
-    <w:r>
-      <w:rPr>
-        <w:b/>
-        <w:bCs/>
-        <w:lang w:val="en-GB"/>
-      </w:rPr>
-      <w:t>&gt;&gt;</w:t>
+      <w:t>Generated by: Rembeh Financial Software (ANTIKRA Mechanism). Date: &lt;&lt;current_date&gt;&gt;</w:t>
     </w:r>
   </w:p>
 </w:ftr>

</xml_diff>